<commit_message>
Use the official title and samples for acmp.ru task 543
Co-Authored-By: Claude Opus 5.5 <noreply@anthropic.com>
Claude-Session: https://claude.ai/code/session_0164xp6oPnH8L5Boehw5Rv1U
</commit_message>
<xml_diff>
--- a/8.1.4.4-loops/zadachi-acmp-8.1.4.4.docx
+++ b/8.1.4.4-loops/zadachi-acmp-8.1.4.4.docx
@@ -507,7 +507,7 @@
           <w:sz w:val="26"/>
           <w:szCs w:val="26"/>
         </w:rPr>
-        <w:t xml:space="preserve">Задача 2. Фальшивые монеты</w:t>
+        <w:t xml:space="preserve">Задача 2. Монеты – 2</w:t>
       </w:r>
       <w:r>
         <w:rPr>
@@ -529,6 +529,21 @@
           <w:szCs w:val="22"/>
         </w:rPr>
         <w:t xml:space="preserve">В N корзинах находятся золотые монеты. Корзины пронумерованы числами от 1 до N. Во всех корзинах, кроме одной, монеты весят по w граммов. В одной корзине монеты фальшивые и весят w − d граммов. Волшебник берёт 1 монету из первой корзины, 2 монеты из второй корзины, и так далее, и, наконец, N − 1 монету из (N − 1)-й корзины. Из N-й корзины он не берёт ничего. Он взвешивает взятые монеты и сразу указывает на корзину с фальшивыми монетами. Требуется написать программу, которая выполняет это волшебство.</w:t>
+      </w:r>
+    </w:p>
+    <w:p>
+      <w:pPr>
+        <w:spacing w:after="40" w:before="0"/>
+      </w:pPr>
+      <w:r>
+        <w:rPr>
+          <w:rFonts w:ascii="Times New Roman" w:cs="Times New Roman" w:eastAsia="Times New Roman" w:hAnsi="Times New Roman"/>
+          <w:i/>
+          <w:iCs/>
+          <w:sz w:val="20"/>
+          <w:szCs w:val="20"/>
+        </w:rPr>
+        <w:t xml:space="preserve">Примеры — с сайта acmp.ru.</w:t>
       </w:r>
     </w:p>
     <w:p>
@@ -678,7 +693,7 @@
                 <w:sz w:val="20"/>
                 <w:szCs w:val="20"/>
               </w:rPr>
-              <w:t xml:space="preserve">5 10 2 94</w:t>
+              <w:t xml:space="preserve">10 25 8 1109</w:t>
             </w:r>
           </w:p>
         </w:tc>
@@ -702,7 +717,7 @@
                 <w:sz w:val="20"/>
                 <w:szCs w:val="20"/>
               </w:rPr>
-              <w:t xml:space="preserve">3</w:t>
+              <w:t xml:space="preserve">2</w:t>
             </w:r>
           </w:p>
         </w:tc>
@@ -732,7 +747,7 @@
                 <w:sz w:val="20"/>
                 <w:szCs w:val="20"/>
               </w:rPr>
-              <w:t xml:space="preserve">4 7 3 42</w:t>
+              <w:t xml:space="preserve">10 25 8 1125</w:t>
             </w:r>
           </w:p>
         </w:tc>
@@ -756,7 +771,61 @@
                 <w:sz w:val="20"/>
                 <w:szCs w:val="20"/>
               </w:rPr>
-              <w:t xml:space="preserve">4</w:t>
+              <w:t xml:space="preserve">10</w:t>
+            </w:r>
+          </w:p>
+        </w:tc>
+      </w:tr>
+      <w:tr>
+        <w:trPr>
+          <w:cantSplit/>
+          <w:tblHeader w:val="false"/>
+        </w:trPr>
+        <w:tc>
+          <w:tcPr>
+            <w:tcW w:type="dxa" w:w="5103"/>
+            <w:tcMar>
+              <w:top w:type="dxa" w:w="60"/>
+              <w:left w:type="dxa" w:w="100"/>
+              <w:bottom w:type="dxa" w:w="60"/>
+              <w:right w:type="dxa" w:w="100"/>
+            </w:tcMar>
+          </w:tcPr>
+          <w:p>
+            <w:pPr>
+              <w:spacing w:after="0"/>
+            </w:pPr>
+            <w:r>
+              <w:rPr>
+                <w:rFonts w:ascii="Courier New" w:cs="Courier New" w:eastAsia="Courier New" w:hAnsi="Courier New"/>
+                <w:sz w:val="20"/>
+                <w:szCs w:val="20"/>
+              </w:rPr>
+              <w:t xml:space="preserve">8000 30 12 959879400</w:t>
+            </w:r>
+          </w:p>
+        </w:tc>
+        <w:tc>
+          <w:tcPr>
+            <w:tcW w:type="dxa" w:w="5103"/>
+            <w:tcMar>
+              <w:top w:type="dxa" w:w="60"/>
+              <w:left w:type="dxa" w:w="100"/>
+              <w:bottom w:type="dxa" w:w="60"/>
+              <w:right w:type="dxa" w:w="100"/>
+            </w:tcMar>
+          </w:tcPr>
+          <w:p>
+            <w:pPr>
+              <w:spacing w:after="0"/>
+            </w:pPr>
+            <w:r>
+              <w:rPr>
+                <w:rFonts w:ascii="Courier New" w:cs="Courier New" w:eastAsia="Courier New" w:hAnsi="Courier New"/>
+                <w:sz w:val="20"/>
+                <w:szCs w:val="20"/>
+              </w:rPr>
+              <w:t xml:space="preserve">50</w:t>
             </w:r>
           </w:p>
         </w:tc>
@@ -3305,7 +3374,7 @@
                 <w:sz w:val="22"/>
                 <w:szCs w:val="22"/>
               </w:rPr>
-              <w:t xml:space="preserve">Фальшивые монеты (№ 543)</w:t>
+              <w:t xml:space="preserve">Монеты – 2 (№ 543)</w:t>
             </w:r>
           </w:p>
         </w:tc>
@@ -4378,7 +4447,7 @@
           <w:sz w:val="24"/>
           <w:szCs w:val="24"/>
         </w:rPr>
-        <w:t xml:space="preserve">2. Фальшивые монеты (№ 543)</w:t>
+        <w:t xml:space="preserve">2. Монеты – 2 (№ 543)</w:t>
       </w:r>
     </w:p>
     <w:p>
@@ -4406,7 +4475,7 @@
           <w:sz w:val="18"/>
           <w:szCs w:val="18"/>
         </w:rPr>
-        <w:t xml:space="preserve">def solve_543(text):         # Фальшивые монеты</w:t>
+        <w:t xml:space="preserve">def solve_543(text):         # Монеты – 2 (фальшивые монеты)</w:t>
       </w:r>
     </w:p>
     <w:p>

</xml_diff>